<commit_message>
Fix delayed status indicator and add web_fetch for real search answers (v0.3.1)
PROCESSING state was set after the Google token refresh instead of
before it, so "Working on your request" could lag 10-15s behind an
actual command. Also added Anthropic's web_fetch tool alongside
web_search - a search snippet alone can't answer things like a live
standings table, but fetching the page it points to can, verified
live against a real Swiss Super League query.
</commit_message>
<xml_diff>
--- a/Myday Release Notes.docx
+++ b/Myday Release Notes.docx
@@ -37,6 +37,92 @@
       </w:r>
       <w:r>
         <w:t xml:space="preserve"> in app/build.gradle.kts (app/build.gradle.kts). This file is the source of truth for what changed between versions — update it (and bump the version) alongside any meaningful batch of work, not on every single commit.</w:t>
+      </w:r>
+    </w:p>
+    <w:p>
+      <w:pPr>
+        <w:spacing w:before="200" w:after="120"/>
+      </w:pPr>
+      <w:r>
+        <w:rPr>
+          <w:rFonts w:ascii="Arial" w:hAnsi="Arial"/>
+          <w:b/>
+          <w:color w:val="1155CC"/>
+          <w:sz w:val="30"/>
+        </w:rPr>
+        <w:t>0.3.1 — 2026-09-03</w:t>
+      </w:r>
+    </w:p>
+    <w:p>
+      <w:r>
+        <w:rPr>
+          <w:b/>
+        </w:rPr>
+        <w:t>Two bugs found during live testing of 0.3.0/0.2.0, fixed.</w:t>
+      </w:r>
+    </w:p>
+    <w:p>
+      <w:pPr>
+        <w:pStyle w:val="ListBullet"/>
+      </w:pPr>
+      <w:r>
+        <w:rPr>
+          <w:b/>
+        </w:rPr>
+        <w:t>"Working on your request" showing up 10-15 seconds late.</w:t>
+      </w:r>
+      <w:r>
+        <w:t xml:space="preserve"> The status was being set only after the Google access-token refresh completed, not before it - and that refresh is a live network round-trip to Google that can genuinely take that long. Moved the state update to fire immediately, before the token fetch, in both the voice-command and daily-briefing paths.</w:t>
+      </w:r>
+    </w:p>
+    <w:p>
+      <w:pPr>
+        <w:pStyle w:val="ListBullet"/>
+      </w:pPr>
+      <w:r>
+        <w:rPr>
+          <w:b/>
+        </w:rPr>
+        <w:t>Web search answering "I can't find that" for things like league standings or streaming charts.</w:t>
+      </w:r>
+      <w:r>
+        <w:t xml:space="preserve"> Verified live against the real API that </w:t>
+      </w:r>
+      <w:r>
+        <w:rPr>
+          <w:rFonts w:ascii="Consolas" w:hAnsi="Consolas"/>
+        </w:rPr>
+        <w:t>web_search</w:t>
+      </w:r>
+      <w:r>
+        <w:t xml:space="preserve"> itself was working correctly - it was searching and finding real pages - but a search result's snippet is often just navigation text, not the actual table/list data on the page. Added Anthropic's </w:t>
+      </w:r>
+      <w:r>
+        <w:rPr>
+          <w:rFonts w:ascii="Consolas" w:hAnsi="Consolas"/>
+        </w:rPr>
+        <w:t>web_fetch</w:t>
+      </w:r>
+      <w:r>
+        <w:t xml:space="preserve"> tool alongside </w:t>
+      </w:r>
+      <w:r>
+        <w:rPr>
+          <w:rFonts w:ascii="Consolas" w:hAnsi="Consolas"/>
+        </w:rPr>
+        <w:t>web_search</w:t>
+      </w:r>
+      <w:r>
+        <w:t xml:space="preserve">: Claude now follows up a promising search result by actually reading that page's full content, which reliably surfaces the real data (verified live: a Swiss Super League standings question now gets the actual current table, sourced by search-then-fetch in the same turn). </w:t>
+      </w:r>
+      <w:r>
+        <w:rPr>
+          <w:rFonts w:ascii="Consolas" w:hAnsi="Consolas"/>
+        </w:rPr>
+        <w:t>web_fetch</w:t>
+      </w:r>
+      <w:r>
+        <w:t xml:space="preserve"> is still in beta and needed its own opt-in header on every API call.</w:t>
       </w:r>
     </w:p>
     <w:p>

</xml_diff>

<commit_message>
Fix long answers cutting off mid-sentence (v0.3.2)
max_tokens was fixed at 600 regardless of topic; a genuinely broad
question landed at 552 tokens in testing, so ordinary length
variance alone was enough to truncate mid-sentence (reported live:
history of mankind cut off partway through). Raised the cap to 1536
and taught Claude to give a short overview + offer to go deeper for
open-ended questions, rather than attempting one long monologue.
</commit_message>
<xml_diff>
--- a/Myday Release Notes.docx
+++ b/Myday Release Notes.docx
@@ -37,6 +37,52 @@
       </w:r>
       <w:r>
         <w:t xml:space="preserve"> in app/build.gradle.kts (app/build.gradle.kts). This file is the source of truth for what changed between versions — update it (and bump the version) alongside any meaningful batch of work, not on every single commit.</w:t>
+      </w:r>
+    </w:p>
+    <w:p>
+      <w:pPr>
+        <w:spacing w:before="200" w:after="120"/>
+      </w:pPr>
+      <w:r>
+        <w:rPr>
+          <w:rFonts w:ascii="Arial" w:hAnsi="Arial"/>
+          <w:b/>
+          <w:color w:val="1155CC"/>
+          <w:sz w:val="30"/>
+        </w:rPr>
+        <w:t>0.3.2 — 2026-09-03</w:t>
+      </w:r>
+    </w:p>
+    <w:p>
+      <w:r>
+        <w:rPr>
+          <w:b/>
+        </w:rPr>
+        <w:t>Long spoken answers cutting off mid-sentence, fixed.</w:t>
+      </w:r>
+    </w:p>
+    <w:p>
+      <w:pPr>
+        <w:pStyle w:val="ListBullet"/>
+      </w:pPr>
+      <w:r>
+        <w:t>Found via live testing: asking about the history of mankind stopped abruptly partway through. Root cause confirmed by testing the exact API call directly - every response was capped at 600 output tokens regardless of topic, and a genuinely broad question landed at 552 tokens in testing, just under that cap, meaning ordinary phrasing variance alone was enough to run over and get cut off mid-sentence.</w:t>
+      </w:r>
+    </w:p>
+    <w:p>
+      <w:pPr>
+        <w:pStyle w:val="ListBullet"/>
+      </w:pPr>
+      <w:r>
+        <w:t>Raised the cap to 1536 tokens for real headroom.</w:t>
+      </w:r>
+    </w:p>
+    <w:p>
+      <w:pPr>
+        <w:pStyle w:val="ListBullet"/>
+      </w:pPr>
+      <w:r>
+        <w:t>Also fixed the underlying UX, not just the ceiling: added guidance so a broad open-ended question (history of X, how Y works) gets a short spoken overview covering the main points, then an offer to go deeper - the way a person answers in conversation - rather than Claude attempting one uninterrupted essay-length monologue every time. Verified live: the same question now finishes cleanly in 360 tokens and ends with "Want me to go deeper into any of these phases?"</w:t>
       </w:r>
     </w:p>
     <w:p>

</xml_diff>

<commit_message>
Add event color support (v0.4.0)
Previously a deliberate non-feature (system prompt told Claude not to
bring up color at all). Now create/update_calendar_event both accept
a color from Google Calendar's fixed 11-name palette, with Claude
mapping casual color words to the closest match - verified live
("make it green" -> Basil). Confirmed out loud before applying, same
as every other real calendar change.
</commit_message>
<xml_diff>
--- a/Myday Release Notes.docx
+++ b/Myday Release Notes.docx
@@ -37,6 +37,62 @@
       </w:r>
       <w:r>
         <w:t xml:space="preserve"> in app/build.gradle.kts (app/build.gradle.kts). This file is the source of truth for what changed between versions — update it (and bump the version) alongside any meaningful batch of work, not on every single commit.</w:t>
+      </w:r>
+    </w:p>
+    <w:p>
+      <w:pPr>
+        <w:spacing w:before="200" w:after="120"/>
+      </w:pPr>
+      <w:r>
+        <w:rPr>
+          <w:rFonts w:ascii="Arial" w:hAnsi="Arial"/>
+          <w:b/>
+          <w:color w:val="1155CC"/>
+          <w:sz w:val="30"/>
+        </w:rPr>
+        <w:t>0.4.0 — 2026-09-04</w:t>
+      </w:r>
+    </w:p>
+    <w:p>
+      <w:r>
+        <w:rPr>
+          <w:b/>
+        </w:rPr>
+        <w:t>Event colors — set or change a meeting's color by voice.</w:t>
+      </w:r>
+    </w:p>
+    <w:p>
+      <w:pPr>
+        <w:pStyle w:val="ListBullet"/>
+      </w:pPr>
+      <w:r>
+        <w:t xml:space="preserve">Previously a deliberate, documented non-feature: the system prompt explicitly told Claude not to bring up event color at all, so asking directly correctly got "I can't do that." Now genuinely built: </w:t>
+      </w:r>
+      <w:r>
+        <w:rPr>
+          <w:rFonts w:ascii="Consolas" w:hAnsi="Consolas"/>
+        </w:rPr>
+        <w:t>create_calendar_event</w:t>
+      </w:r>
+      <w:r>
+        <w:t xml:space="preserve"> and </w:t>
+      </w:r>
+      <w:r>
+        <w:rPr>
+          <w:rFonts w:ascii="Consolas" w:hAnsi="Consolas"/>
+        </w:rPr>
+        <w:t>update_calendar_event</w:t>
+      </w:r>
+      <w:r>
+        <w:t xml:space="preserve"> both accept a color, using Google Calendar's fixed 11-color palette (Lavender, Sage, Grape, Flamingo, Banana, Tangerine, Peacock, Graphite, Blueberry, Basil, Tomato) - there's no arbitrary/free-form color, so a casual request ("make it red," "turn it green") is mapped by Claude to the closest one of those 11. Verified live: "make it green" correctly resolved to Basil.</w:t>
+      </w:r>
+    </w:p>
+    <w:p>
+      <w:pPr>
+        <w:pStyle w:val="ListBullet"/>
+      </w:pPr>
+      <w:r>
+        <w:t>Like every other real change, this is confirmed out loud before it happens - "for '[event]', do you want me to change its color to [name]?"</w:t>
       </w:r>
     </w:p>
     <w:p>

</xml_diff>

<commit_message>
Add Jobs and Google-Notifications auto-filing categories (v0.4.1, v0.4.2)
Two new deterministic sender/subject-match categories, same pattern
as Payments: Myday/Jobs catches LinkedIn job alerts, Jobs.ch, and
<company>-jobnotification style senders; Myday/Google-Notifications
catches google.com automated mail (Family Link, security alerts),
deliberately excluding Calendar's own notification sender since
MeetingEmailCleanupWorker already handles that separately.
</commit_message>
<xml_diff>
--- a/Myday Release Notes.docx
+++ b/Myday Release Notes.docx
@@ -37,6 +37,160 @@
       </w:r>
       <w:r>
         <w:t xml:space="preserve"> in app/build.gradle.kts (app/build.gradle.kts). This file is the source of truth for what changed between versions — update it (and bump the version) alongside any meaningful batch of work, not on every single commit.</w:t>
+      </w:r>
+    </w:p>
+    <w:p>
+      <w:pPr>
+        <w:spacing w:before="200" w:after="120"/>
+      </w:pPr>
+      <w:r>
+        <w:rPr>
+          <w:rFonts w:ascii="Arial" w:hAnsi="Arial"/>
+          <w:b/>
+          <w:color w:val="1155CC"/>
+          <w:sz w:val="30"/>
+        </w:rPr>
+        <w:t>0.4.2 — 2026-09-04</w:t>
+      </w:r>
+    </w:p>
+    <w:p>
+      <w:r>
+        <w:rPr>
+          <w:b/>
+        </w:rPr>
+        <w:t>New auto-filing category: Google's own notification emails, filed to Myday/Google-Notifications.</w:t>
+      </w:r>
+    </w:p>
+    <w:p>
+      <w:pPr>
+        <w:pStyle w:val="ListBullet"/>
+      </w:pPr>
+      <w:r>
+        <w:t xml:space="preserve">Another deterministic sender match, same reasoning as Payments/Jobs: catches anything from a google.com notification domain (Family Link's </w:t>
+      </w:r>
+      <w:r>
+        <w:rPr>
+          <w:rFonts w:ascii="Consolas" w:hAnsi="Consolas"/>
+        </w:rPr>
+        <w:t>families-noreply@google.com</w:t>
+      </w:r>
+      <w:r>
+        <w:t xml:space="preserve">, security alerts from </w:t>
+      </w:r>
+      <w:r>
+        <w:rPr>
+          <w:rFonts w:ascii="Consolas" w:hAnsi="Consolas"/>
+        </w:rPr>
+        <w:t>accounts.google.com</w:t>
+      </w:r>
+      <w:r>
+        <w:t>, and similar automated Google mail) - not a model guess.</w:t>
+      </w:r>
+    </w:p>
+    <w:p>
+      <w:pPr>
+        <w:pStyle w:val="ListBullet"/>
+      </w:pPr>
+      <w:r>
+        <w:t>Deliberately excludes Google Calendar's own notification sender (</w:t>
+      </w:r>
+      <w:r>
+        <w:rPr>
+          <w:rFonts w:ascii="Consolas" w:hAnsi="Consolas"/>
+        </w:rPr>
+        <w:t>calendar-notification@google.com</w:t>
+      </w:r>
+      <w:r>
+        <w:t>) - that one's already handled by the separate meeting-notification cleanup, which archives it once the meeting it describes has actually ended. Filing it here too would have the two workers fighting over the same emails.</w:t>
+      </w:r>
+    </w:p>
+    <w:p>
+      <w:pPr>
+        <w:pStyle w:val="ListBullet"/>
+      </w:pPr>
+      <w:r>
+        <w:t>Checked alongside the other deterministic categories, ahead of the promotion allowlist and the LLM step; manual "Run Email Cleanup Now" and the periodic background run both report a Google-notification count now.</w:t>
+      </w:r>
+    </w:p>
+    <w:p>
+      <w:pPr>
+        <w:spacing w:before="200" w:after="120"/>
+      </w:pPr>
+      <w:r>
+        <w:rPr>
+          <w:rFonts w:ascii="Arial" w:hAnsi="Arial"/>
+          <w:b/>
+          <w:color w:val="1155CC"/>
+          <w:sz w:val="30"/>
+        </w:rPr>
+        <w:t>0.4.1 — 2026-09-04</w:t>
+      </w:r>
+    </w:p>
+    <w:p>
+      <w:r>
+        <w:rPr>
+          <w:b/>
+        </w:rPr>
+        <w:t>New auto-filing category: job search emails, filed to Myday/Jobs.</w:t>
+      </w:r>
+    </w:p>
+    <w:p>
+      <w:pPr>
+        <w:pStyle w:val="ListBullet"/>
+      </w:pPr>
+      <w:r>
+        <w:t>Same deterministic-match pattern as Payments (a plain text check, not an LLM guess) - job-search mail has clear, identifiable senders, so it doesn't need a model's judgment call any more than an invoice does.</w:t>
+      </w:r>
+    </w:p>
+    <w:p>
+      <w:pPr>
+        <w:pStyle w:val="ListBullet"/>
+      </w:pPr>
+      <w:r>
+        <w:t xml:space="preserve">Catches: LinkedIn job alerts (its own </w:t>
+      </w:r>
+      <w:r>
+        <w:rPr>
+          <w:rFonts w:ascii="Consolas" w:hAnsi="Consolas"/>
+        </w:rPr>
+        <w:t>jobalerts-noreply@linkedin.com</w:t>
+      </w:r>
+      <w:r>
+        <w:t xml:space="preserve">-style sender), Jobs.ch, and any </w:t>
+      </w:r>
+      <w:r>
+        <w:rPr>
+          <w:rFonts w:ascii="Consolas" w:hAnsi="Consolas"/>
+        </w:rPr>
+        <w:t>&lt;company&gt;-jobnotification</w:t>
+      </w:r>
+      <w:r>
+        <w:t xml:space="preserve"> style automated sender the way many companies' applicant-tracking systems send them (e.g. </w:t>
+      </w:r>
+      <w:r>
+        <w:rPr>
+          <w:rFonts w:ascii="Consolas" w:hAnsi="Consolas"/>
+        </w:rPr>
+        <w:t>swissre-jobnotification@...</w:t>
+      </w:r>
+      <w:r>
+        <w:t>) - plus "job alert" in the subject line as a catch-all for senders that don't match one of those exact patterns.</w:t>
+      </w:r>
+    </w:p>
+    <w:p>
+      <w:pPr>
+        <w:pStyle w:val="ListBullet"/>
+      </w:pPr>
+      <w:r>
+        <w:t>Checked right after the payment-keyword match, ahead of the promotion allowlist and the LLM classification step - same reasoning as Payments: a deliberate, deterministic user instruction shouldn't be second-guessed by a model.</w:t>
+      </w:r>
+    </w:p>
+    <w:p>
+      <w:pPr>
+        <w:pStyle w:val="ListBullet"/>
+      </w:pPr>
+      <w:r>
+        <w:t>The manual "Run Email Cleanup Now" result and the periodic background run both now report a jobs count alongside promotions/junk/payments.</w:t>
       </w:r>
     </w:p>
     <w:p>

</xml_diff>

<commit_message>
Fix Jobs/Google-Notifications missing backlog mail (v0.4.3)
Root cause: mail already tagged Myday/Reviewed under pre-existing
rules was permanently unreachable to the new categories, since the
main cleanup query excludes anything already Reviewed. Added a
recurring backlog sweep for just these two categories that ignores
the Reviewed label. Also added "careers" and "jobgether" sender
patterns - two real senders (elca.ch careers address, Jobgether)
matched nothing in the original pattern list.
</commit_message>
<xml_diff>
--- a/Myday Release Notes.docx
+++ b/Myday Release Notes.docx
@@ -37,6 +37,160 @@
       </w:r>
       <w:r>
         <w:t xml:space="preserve"> in app/build.gradle.kts (app/build.gradle.kts). This file is the source of truth for what changed between versions — update it (and bump the version) alongside any meaningful batch of work, not on every single commit.</w:t>
+      </w:r>
+    </w:p>
+    <w:p>
+      <w:pPr>
+        <w:spacing w:before="200" w:after="120"/>
+      </w:pPr>
+      <w:r>
+        <w:rPr>
+          <w:rFonts w:ascii="Arial" w:hAnsi="Arial"/>
+          <w:b/>
+          <w:color w:val="1155CC"/>
+          <w:sz w:val="30"/>
+        </w:rPr>
+        <w:t>0.4.3 — 2026-09-04</w:t>
+      </w:r>
+    </w:p>
+    <w:p>
+      <w:r>
+        <w:rPr>
+          <w:b/>
+        </w:rPr>
+        <w:t>Jobs/Google-Notifications missing real mail, fixed - two separate bugs.</w:t>
+      </w:r>
+    </w:p>
+    <w:p>
+      <w:pPr>
+        <w:pStyle w:val="ListBullet"/>
+      </w:pPr>
+      <w:r>
+        <w:rPr>
+          <w:b/>
+        </w:rPr>
+        <w:t>Backlog stuck behind the Reviewed label.</w:t>
+      </w:r>
+      <w:r>
+        <w:t xml:space="preserve"> The main cleanup query only looks at mail not yet marked </w:t>
+      </w:r>
+      <w:r>
+        <w:rPr>
+          <w:rFonts w:ascii="Consolas" w:hAnsi="Consolas"/>
+        </w:rPr>
+        <w:t>Myday/Reviewed</w:t>
+      </w:r>
+      <w:r>
+        <w:t xml:space="preserve">; every one of the reported emails had already been Reviewed+Kept under the old rules, before these two categories existed, which made them permanently unreachable by the new logic. Added a second pass, </w:t>
+      </w:r>
+      <w:r>
+        <w:rPr>
+          <w:rFonts w:ascii="Consolas" w:hAnsi="Consolas"/>
+        </w:rPr>
+        <w:t>sweepBacklogForNewCategories</w:t>
+      </w:r>
+      <w:r>
+        <w:t xml:space="preserve">, that reprocesses still-in-inbox mail for just these two categories regardless of the Reviewed label - runs every cycle, cheap (no LLM calls), and naturally stops touching anything once it's been filed. This also means any </w:t>
+      </w:r>
+      <w:r>
+        <w:rPr>
+          <w:i/>
+        </w:rPr>
+        <w:t>future</w:t>
+      </w:r>
+      <w:r>
+        <w:t xml:space="preserve"> new deterministic category won't hit the same wall.</w:t>
+      </w:r>
+    </w:p>
+    <w:p>
+      <w:pPr>
+        <w:pStyle w:val="ListBullet"/>
+      </w:pPr>
+      <w:r>
+        <w:rPr>
+          <w:b/>
+        </w:rPr>
+        <w:t>Two genuine pattern gaps.</w:t>
+      </w:r>
+      <w:r>
+        <w:t xml:space="preserve"> </w:t>
+      </w:r>
+      <w:r>
+        <w:rPr>
+          <w:rFonts w:ascii="Consolas" w:hAnsi="Consolas"/>
+        </w:rPr>
+        <w:t>noreply_careers@elca.ch</w:t>
+      </w:r>
+      <w:r>
+        <w:t xml:space="preserve"> (a company's own careers address, no "job" substring at all) and </w:t>
+      </w:r>
+      <w:r>
+        <w:rPr>
+          <w:rFonts w:ascii="Consolas" w:hAnsi="Consolas"/>
+        </w:rPr>
+        <w:t>support@match.jobgether.com</w:t>
+      </w:r>
+      <w:r>
+        <w:t xml:space="preserve"> (the domain is </w:t>
+      </w:r>
+      <w:r>
+        <w:rPr>
+          <w:rFonts w:ascii="Consolas" w:hAnsi="Consolas"/>
+        </w:rPr>
+        <w:t>jobgether.com</w:t>
+      </w:r>
+      <w:r>
+        <w:t xml:space="preserve">, not </w:t>
+      </w:r>
+      <w:r>
+        <w:rPr>
+          <w:rFonts w:ascii="Consolas" w:hAnsi="Consolas"/>
+        </w:rPr>
+        <w:t>jobs.ch</w:t>
+      </w:r>
+      <w:r>
+        <w:t>/</w:t>
+      </w:r>
+      <w:r>
+        <w:rPr>
+          <w:rFonts w:ascii="Consolas" w:hAnsi="Consolas"/>
+        </w:rPr>
+        <w:t>jobnotification</w:t>
+      </w:r>
+      <w:r>
+        <w:t xml:space="preserve">) matched nothing. Added </w:t>
+      </w:r>
+      <w:r>
+        <w:rPr>
+          <w:rFonts w:ascii="Consolas" w:hAnsi="Consolas"/>
+        </w:rPr>
+        <w:t>careers</w:t>
+      </w:r>
+      <w:r>
+        <w:t xml:space="preserve"> and </w:t>
+      </w:r>
+      <w:r>
+        <w:rPr>
+          <w:rFonts w:ascii="Consolas" w:hAnsi="Consolas"/>
+        </w:rPr>
+        <w:t>jobgether</w:t>
+      </w:r>
+      <w:r>
+        <w:t xml:space="preserve"> to the sender-pattern list.</w:t>
+      </w:r>
+    </w:p>
+    <w:p>
+      <w:pPr>
+        <w:pStyle w:val="ListBullet"/>
+      </w:pPr>
+      <w:r>
+        <w:rPr>
+          <w:rFonts w:ascii="Consolas" w:hAnsi="Consolas"/>
+        </w:rPr>
+        <w:t>accounts.google.com</w:t>
+      </w:r>
+      <w:r>
+        <w:t xml:space="preserve"> mail was already correctly matched by the existing pattern - its failure was purely the Reviewed-backlog issue above, not a pattern bug.</w:t>
       </w:r>
     </w:p>
     <w:p>

</xml_diff>

<commit_message>
Generalize backlog sweep to Payments, add 30-day deep-cleanup run (v0.4.4)
The Reviewed-backlog bug fixed in 0.4.3 for Jobs/Google-Notifications
turned out to also affect Payments - found live via a stuck Aug 31
receipt email. Renamed/extended the sweep to cover all three
deterministic categories. Also added a manual "Run Email Cleanup
(Last 30 Days)" action that reprocesses older/already-Reviewed mail
on demand, capped at 200 messages so a wider window can't turn into
an unbounded scan of years of old mail.
</commit_message>
<xml_diff>
--- a/Myday Release Notes.docx
+++ b/Myday Release Notes.docx
@@ -37,6 +37,71 @@
       </w:r>
       <w:r>
         <w:t xml:space="preserve"> in app/build.gradle.kts (app/build.gradle.kts). This file is the source of truth for what changed between versions — update it (and bump the version) alongside any meaningful batch of work, not on every single commit.</w:t>
+      </w:r>
+    </w:p>
+    <w:p>
+      <w:pPr>
+        <w:spacing w:before="200" w:after="120"/>
+      </w:pPr>
+      <w:r>
+        <w:rPr>
+          <w:rFonts w:ascii="Arial" w:hAnsi="Arial"/>
+          <w:b/>
+          <w:color w:val="1155CC"/>
+          <w:sz w:val="30"/>
+        </w:rPr>
+        <w:t>0.4.4 — 2026-09-04</w:t>
+      </w:r>
+    </w:p>
+    <w:p>
+      <w:r>
+        <w:rPr>
+          <w:b/>
+        </w:rPr>
+        <w:t>The Reviewed-backlog bug also hit Payments - generalized the fix, plus a manual 30-day deep-cleanup run.</w:t>
+      </w:r>
+    </w:p>
+    <w:p>
+      <w:pPr>
+        <w:pStyle w:val="ListBullet"/>
+      </w:pPr>
+      <w:r>
+        <w:t xml:space="preserve">Found live: a Sep 2 receipt email from Anthropic, PBC, dated Aug 31 - before the Payments category existed - stayed stuck in the inbox forever, unreached by either the main loop or the 0.4.3 backlog sweep (which only covered Jobs/Google-Notifications). Same root cause as 0.4.3, just for a third category. Generalized </w:t>
+      </w:r>
+      <w:r>
+        <w:rPr>
+          <w:rFonts w:ascii="Consolas" w:hAnsi="Consolas"/>
+        </w:rPr>
+        <w:t>sweepBacklogForNewCategories</w:t>
+      </w:r>
+      <w:r>
+        <w:t xml:space="preserve"> into </w:t>
+      </w:r>
+      <w:r>
+        <w:rPr>
+          <w:rFonts w:ascii="Consolas" w:hAnsi="Consolas"/>
+        </w:rPr>
+        <w:t>sweepBacklogForDeterministicCategories</w:t>
+      </w:r>
+      <w:r>
+        <w:t>, now covering Payments too.</w:t>
+      </w:r>
+    </w:p>
+    <w:p>
+      <w:pPr>
+        <w:pStyle w:val="ListBullet"/>
+      </w:pPr>
+      <w:r>
+        <w:t xml:space="preserve">New manual run: </w:t>
+      </w:r>
+      <w:r>
+        <w:rPr>
+          <w:b/>
+        </w:rPr>
+        <w:t>Run Email Cleanup (Last 30 Days)</w:t>
+      </w:r>
+      <w:r>
+        <w:t xml:space="preserve"> - reprocesses the last 30 days of inbox mail through the full classification pipeline (including already-Reviewed mail and the LLM promotion/keep call), not just what's new. Explicitly capped at 200 messages regardless of the date window, so a wider request can't turn into an unbounded, hours-long scan of years of old mail - the normal periodic/quick-check run is untouched and still just looks at the last 3 days.</w:t>
       </w:r>
     </w:p>
     <w:p>

</xml_diff>

<commit_message>
Rename Email Cleanup menu item for clarity (v0.4.5)
"Run Email Cleanup Now" didn't say what window it actually covers
(3 days, unReviewed only) - renamed to "Run Email Cleanup (Last 3
Days)" to read clearly next to the new 30-day option.
</commit_message>
<xml_diff>
--- a/Myday Release Notes.docx
+++ b/Myday Release Notes.docx
@@ -37,6 +37,36 @@
       </w:r>
       <w:r>
         <w:t xml:space="preserve"> in app/build.gradle.kts (app/build.gradle.kts). This file is the source of truth for what changed between versions — update it (and bump the version) alongside any meaningful batch of work, not on every single commit.</w:t>
+      </w:r>
+    </w:p>
+    <w:p>
+      <w:pPr>
+        <w:spacing w:before="200" w:after="120"/>
+      </w:pPr>
+      <w:r>
+        <w:rPr>
+          <w:rFonts w:ascii="Arial" w:hAnsi="Arial"/>
+          <w:b/>
+          <w:color w:val="1155CC"/>
+          <w:sz w:val="30"/>
+        </w:rPr>
+        <w:t>0.4.5 — 2026-09-04</w:t>
+      </w:r>
+    </w:p>
+    <w:p>
+      <w:r>
+        <w:rPr>
+          <w:b/>
+        </w:rPr>
+        <w:t>Renamed "Run Email Cleanup Now" to "Run Email Cleanup (Last 3 Days)".</w:t>
+      </w:r>
+    </w:p>
+    <w:p>
+      <w:pPr>
+        <w:pStyle w:val="ListBullet"/>
+      </w:pPr>
+      <w:r>
+        <w:t>With the new 30-day deep-run sitting right next to it in the menu, "Now" didn't say what it actually does (or didn't do - only new, unReviewed mail from the last 3 days). Matches the new item's naming pattern so the two options read clearly side by side.</w:t>
       </w:r>
     </w:p>
     <w:p>

</xml_diff>